<commit_message>
Update intro title and tighten pacing across all 8 scenes
- Scene 1 now shows "PROBLEMA 2" and the exact problem statement
  ("Hallar a y b para que g(x) sea continua en R") instead of the
  generic challenge title.
- Reworked timing constants in every scene: shorter reveal durations,
  tighter stagger between elements, and trimmed trailing holds. Total
  runtime goes from 4:31 to 3:07, still within the 3:00-4:50 target
  but noticeably snappier per user feedback that it felt slow.
- Guion docx regenerated with matching timestamps and an updated
  scene 1 narration line referencing "Problema 2".
</commit_message>
<xml_diff>
--- a/video_estacion3/Guion_Desafio_Parametros.docx
+++ b/video_estacion3/Guion_Desafio_Parametros.docx
@@ -43,7 +43,7 @@
           <w:color w:val="606060"/>
           <w:sz w:val="21"/>
         </w:rPr>
-        <w:t>Duración total estimada: 4:31 min  (271 s)</w:t>
+        <w:t>Duración total estimada: 3:07 min  (187 s)</w:t>
       </w:r>
     </w:p>
     <w:p/>
@@ -158,7 +158,7 @@
           </w:tcPr>
           <w:p>
             <w:r>
-              <w:t>0:00–0:15</w:t>
+              <w:t>0:00–0:14</w:t>
             </w:r>
           </w:p>
         </w:tc>
@@ -204,7 +204,7 @@
           </w:tcPr>
           <w:p>
             <w:r>
-              <w:t>0:15–0:53</w:t>
+              <w:t>0:14–0:34</w:t>
             </w:r>
           </w:p>
         </w:tc>
@@ -250,7 +250,7 @@
           </w:tcPr>
           <w:p>
             <w:r>
-              <w:t>0:53–1:38</w:t>
+              <w:t>0:34–1:07</w:t>
             </w:r>
           </w:p>
         </w:tc>
@@ -296,7 +296,7 @@
           </w:tcPr>
           <w:p>
             <w:r>
-              <w:t>1:38–2:18</w:t>
+              <w:t>1:07–1:29</w:t>
             </w:r>
           </w:p>
         </w:tc>
@@ -342,7 +342,7 @@
           </w:tcPr>
           <w:p>
             <w:r>
-              <w:t>2:18–2:53</w:t>
+              <w:t>1:29–1:49</w:t>
             </w:r>
           </w:p>
         </w:tc>
@@ -388,7 +388,7 @@
           </w:tcPr>
           <w:p>
             <w:r>
-              <w:t>2:53–3:28</w:t>
+              <w:t>1:49–2:17</w:t>
             </w:r>
           </w:p>
         </w:tc>
@@ -434,7 +434,7 @@
           </w:tcPr>
           <w:p>
             <w:r>
-              <w:t>3:28–4:06</w:t>
+              <w:t>2:17–2:48</w:t>
             </w:r>
           </w:p>
         </w:tc>
@@ -480,7 +480,7 @@
           </w:tcPr>
           <w:p>
             <w:r>
-              <w:t>4:06–4:31</w:t>
+              <w:t>2:48–3:07</w:t>
             </w:r>
           </w:p>
         </w:tc>
@@ -518,7 +518,7 @@
         <w:pStyle w:val="Heading2"/>
       </w:pPr>
       <w:r>
-        <w:t>Escena 1 — Intro  (0:00–0:15)</w:t>
+        <w:t>Escena 1 — Intro  (0:00–0:14)</w:t>
       </w:r>
     </w:p>
     <w:p>
@@ -540,7 +540,7 @@
           <w:color w:val="B47B0E"/>
           <w:sz w:val="25"/>
         </w:rPr>
-        <w:t>¡Hola a todos! Bienvenidos a nuestro video: Desafío de Parámetros, de Matemática, tercero BATIN, Estación 3.</w:t>
+        <w:t>¡Hola a todos! Bienvenidos a nuestro video de Matemática, tercero BATIN, Estación 3: Problema 2.</w:t>
       </w:r>
     </w:p>
     <w:p>
@@ -552,7 +552,7 @@
           <w:color w:val="B47B0E"/>
           <w:sz w:val="25"/>
         </w:rPr>
-        <w:t>Somos Bruno Ferro, Fabrizio Osorio, Sebastián Cardoso y Eugenia Pérez, del San Ignacio de Loyola School.</w:t>
+        <w:t>Tenemos que hallar a y b para que g de x sea continua en todos los reales.</w:t>
       </w:r>
     </w:p>
     <w:p>
@@ -564,7 +564,7 @@
           <w:color w:val="B47B0E"/>
           <w:sz w:val="25"/>
         </w:rPr>
-        <w:t>Hoy vamos a resolver un problema de continuidad de funciones definidas por partes.</w:t>
+        <w:t>Somos Bruno Ferro, Fabrizio Osorio, Sebastián Cardoso y Eugenia Pérez, del San Ignacio de Loyola School. ¡Vamos a resolverlo!</w:t>
       </w:r>
     </w:p>
     <w:p/>
@@ -573,7 +573,7 @@
         <w:pStyle w:val="Heading2"/>
       </w:pPr>
       <w:r>
-        <w:t>Escena 2 — Condiciones de continuidad  (0:15–0:53)</w:t>
+        <w:t>Escena 2 — Condiciones de continuidad  (0:14–0:34)</w:t>
       </w:r>
     </w:p>
     <w:p>
@@ -652,7 +652,7 @@
         <w:pStyle w:val="Heading2"/>
       </w:pPr>
       <w:r>
-        <w:t>Escena 3 — Planteo del problema  (0:53–1:38)</w:t>
+        <w:t>Escena 3 — Planteo del problema  (0:34–1:07)</w:t>
       </w:r>
     </w:p>
     <w:p>
@@ -731,7 +731,7 @@
         <w:pStyle w:val="Heading2"/>
       </w:pPr>
       <w:r>
-        <w:t>Escena 4 — Condición en x = 1  (1:38–2:18)</w:t>
+        <w:t>Escena 4 — Condición en x = 1  (1:07–1:29)</w:t>
       </w:r>
     </w:p>
     <w:p>
@@ -798,7 +798,7 @@
         <w:pStyle w:val="Heading2"/>
       </w:pPr>
       <w:r>
-        <w:t>Escena 5 — Condición en x = 3  (2:18–2:53)</w:t>
+        <w:t>Escena 5 — Condición en x = 3  (1:29–1:49)</w:t>
       </w:r>
     </w:p>
     <w:p>
@@ -865,7 +865,7 @@
         <w:pStyle w:val="Heading2"/>
       </w:pPr>
       <w:r>
-        <w:t>Escena 6 — Resolver el sistema  (2:53–3:28)</w:t>
+        <w:t>Escena 6 — Resolver el sistema  (1:49–2:17)</w:t>
       </w:r>
     </w:p>
     <w:p>
@@ -944,7 +944,7 @@
         <w:pStyle w:val="Heading2"/>
       </w:pPr>
       <w:r>
-        <w:t>Escena 7 — Verificación gráfica  (3:28–4:06)</w:t>
+        <w:t>Escena 7 — Verificación gráfica  (2:17–2:48)</w:t>
       </w:r>
     </w:p>
     <w:p>
@@ -1023,7 +1023,7 @@
         <w:pStyle w:val="Heading2"/>
       </w:pPr>
       <w:r>
-        <w:t>Escena 8 — Cierre  (4:06–4:31)</w:t>
+        <w:t>Escena 8 — Cierre  (2:48–3:07)</w:t>
       </w:r>
     </w:p>
     <w:p>

</xml_diff>

<commit_message>
Fix station number: Estación 3 -> Estación 2 in Problema 2 video
Corrected per user: this assignment is Estación 2, not Estación 3.
Updated the on-screen course line in scene 1, the guion docx cover
and narration text, and re-rendered/re-concatenated the final video.
</commit_message>
<xml_diff>
--- a/video_estacion3/Guion_Desafio_Parametros.docx
+++ b/video_estacion3/Guion_Desafio_Parametros.docx
@@ -20,7 +20,7 @@
           <w:i/>
           <w:sz w:val="24"/>
         </w:rPr>
-        <w:t>Matemática · 3° BATIN · Estación 3 · San Ignacio de Loyola School</w:t>
+        <w:t>Matemática · 3° BATIN · Estación 2 · San Ignacio de Loyola School</w:t>
       </w:r>
     </w:p>
     <w:p>
@@ -540,7 +540,7 @@
           <w:color w:val="B47B0E"/>
           <w:sz w:val="25"/>
         </w:rPr>
-        <w:t>¡Hola a todos! Bienvenidos a nuestro video de Matemática, tercero BATIN, Estación 3: Problema 2.</w:t>
+        <w:t>¡Hola a todos! Bienvenidos a nuestro video de Matemática, tercero BATIN, Estación 2: Problema 2.</w:t>
       </w:r>
     </w:p>
     <w:p>

</xml_diff>